<commit_message>
Merge Split + MC
</commit_message>
<xml_diff>
--- a/Applications/_BaseDocuments/Efraim Taranto - Cover Letter.docx
+++ b/Applications/_BaseDocuments/Efraim Taranto - Cover Letter.docx
@@ -2,55 +2,6 @@
 <file path=word/document.xml><?xml version="1.0" encoding="utf-8"?>
 <w:document xmlns:wpc="http://schemas.microsoft.com/office/word/2010/wordprocessingCanvas" xmlns:cx="http://schemas.microsoft.com/office/drawing/2014/chartex" xmlns:cx1="http://schemas.microsoft.com/office/drawing/2015/9/8/chartex" xmlns:cx2="http://schemas.microsoft.com/office/drawing/2015/10/21/chartex" xmlns:cx3="http://schemas.microsoft.com/office/drawing/2016/5/9/chartex" xmlns:cx4="http://schemas.microsoft.com/office/drawing/2016/5/10/chartex" xmlns:cx5="http://schemas.microsoft.com/office/drawing/2016/5/11/chartex" xmlns:cx6="http://schemas.microsoft.com/office/drawing/2016/5/12/chartex" xmlns:cx7="http://schemas.microsoft.com/office/drawing/2016/5/13/chartex" xmlns:cx8="http://schemas.microsoft.com/office/drawing/2016/5/14/chartex" xmlns:mc="http://schemas.openxmlformats.org/markup-compatibility/2006" xmlns:aink="http://schemas.microsoft.com/office/drawing/2016/ink" xmlns:am3d="http://schemas.microsoft.com/office/drawing/2017/model3d" xmlns:o="urn:schemas-microsoft-com:office:office" xmlns:oel="http://schemas.microsoft.com/office/2019/extlst" xmlns:r="http://schemas.openxmlformats.org/officeDocument/2006/relationships" xmlns:m="http://schemas.openxmlformats.org/officeDocument/2006/math" xmlns:v="urn:schemas-microsoft-com:vml" xmlns:wp14="http://schemas.microsoft.com/office/word/2010/wordprocessingDrawing" xmlns:wp="http://schemas.openxmlformats.org/drawingml/2006/wordprocessingDrawing" xmlns:w10="urn:schemas-microsoft-com:office:word" xmlns:w="http://schemas.openxmlformats.org/wordprocessingml/2006/main" xmlns:w14="http://schemas.microsoft.com/office/word/2010/wordml" xmlns:w15="http://schemas.microsoft.com/office/word/2012/wordml" xmlns:w16cex="http://schemas.microsoft.com/office/word/2018/wordml/cex" xmlns:w16cid="http://schemas.microsoft.com/office/word/2016/wordml/cid" xmlns:w16="http://schemas.microsoft.com/office/word/2018/wordml" xmlns:w16du="http://schemas.microsoft.com/office/word/2023/wordml/word16du" xmlns:w16sdtdh="http://schemas.microsoft.com/office/word/2020/wordml/sdtdatahash" xmlns:w16sdtfl="http://schemas.microsoft.com/office/word/2024/wordml/sdtformatlock" xmlns:w16se="http://schemas.microsoft.com/office/word/2015/wordml/symex" xmlns:wpg="http://schemas.microsoft.com/office/word/2010/wordprocessingGroup" xmlns:wpi="http://schemas.microsoft.com/office/word/2010/wordprocessingInk" xmlns:wne="http://schemas.microsoft.com/office/word/2006/wordml" xmlns:wps="http://schemas.microsoft.com/office/word/2010/wordprocessingShape" mc:Ignorable="w14 w15 w16se w16cid w16 w16cex w16sdtdh w16sdtfl w16du wp14">
   <w:body>
-    <w:p>
-      <w:pPr>
-        <w:pStyle w:val="Title"/>
-      </w:pPr>
-      <w:r>
-        <w:t>Efraim Taranto</w:t>
-      </w:r>
-      <w:r>
-        <w:t xml:space="preserve"> </w:t>
-      </w:r>
-      <w:r>
-        <w:tab/>
-      </w:r>
-      <w:r>
-        <w:tab/>
-      </w:r>
-      <w:r>
-        <w:tab/>
-      </w:r>
-      <w:r>
-        <w:tab/>
-      </w:r>
-      <w:r>
-        <w:tab/>
-      </w:r>
-      <w:r>
-        <w:tab/>
-      </w:r>
-      <w:r>
-        <w:tab/>
-      </w:r>
-    </w:p>
-    <w:p>
-      <w:pPr>
-        <w:pStyle w:val="Quote"/>
-      </w:pPr>
-      <w:r>
-        <w:t xml:space="preserve">Technology </w:t>
-      </w:r>
-      <w:r>
-        <w:t>and</w:t>
-      </w:r>
-      <w:r>
-        <w:t xml:space="preserve"> Delivery | Engineering | Architecture | Enterprise Platforms</w:t>
-      </w:r>
-      <w:r>
-        <w:t xml:space="preserve"> | Transformation</w:t>
-      </w:r>
-    </w:p>
     <w:p>
       <w:pPr>
         <w:pStyle w:val="Title"/>
@@ -63,36 +14,7 @@
         </w:rPr>
       </w:pPr>
       <w:r>
-        <w:rPr>
-          <w:rFonts w:eastAsiaTheme="minorHAnsi"/>
-          <w:b/>
-          <w:bCs/>
-          <w:spacing w:val="0"/>
-          <w:kern w:val="2"/>
-          <w:sz w:val="22"/>
-          <w:szCs w:val="22"/>
-        </w:rPr>
-        <w:t>Australian Citizen</w:t>
-      </w:r>
-      <w:r>
-        <w:rPr>
-          <w:rFonts w:eastAsiaTheme="minorHAnsi"/>
-          <w:spacing w:val="0"/>
-          <w:kern w:val="2"/>
-          <w:sz w:val="22"/>
-          <w:szCs w:val="22"/>
-        </w:rPr>
-        <w:t xml:space="preserve"> – Ormond, Victoria 320</w:t>
-      </w:r>
-      <w:r>
-        <w:rPr>
-          <w:rFonts w:eastAsiaTheme="minorHAnsi"/>
-          <w:spacing w:val="0"/>
-          <w:kern w:val="2"/>
-          <w:sz w:val="22"/>
-          <w:szCs w:val="22"/>
-        </w:rPr>
-        <w:t>4</w:t>
+        <w:t>Efraim Taranto</w:t>
       </w:r>
     </w:p>
     <w:p>
@@ -121,6 +43,16 @@
           <w:t>https://www.linkedin.com/in/efraim-taranto-2306344</w:t>
         </w:r>
       </w:hyperlink>
+      <w:r>
+        <w:t xml:space="preserve"> | </w:t>
+      </w:r>
+      <w:r>
+        <w:rPr>
+          <w:sz w:val="20"/>
+          <w:szCs w:val="20"/>
+        </w:rPr>
+        <w:t>Ormond, VIC 3204</w:t>
+      </w:r>
     </w:p>
     <w:p>
       <w:pPr>
@@ -150,26 +82,36 @@
         <w:rPr>
           <w:noProof/>
         </w:rPr>
-        <w:t>11 September 2026</w:t>
+        <w:t>5 October 2026</w:t>
       </w:r>
       <w:r>
         <w:fldChar w:fldCharType="end"/>
       </w:r>
     </w:p>
     <w:p>
+      <w:pPr>
+        <w:rPr>
+          <w:lang w:eastAsia="en-AU"/>
+        </w:rPr>
+      </w:pPr>
       <w:r>
-        <w:t>To:</w:t>
+        <w:t xml:space="preserve">To: Hiring Manager, </w:t>
       </w:r>
+      <w:proofErr w:type="spellStart"/>
       <w:r>
-        <w:t xml:space="preserve"> </w:t>
+        <w:t>Pepperstone</w:t>
       </w:r>
+      <w:proofErr w:type="spellEnd"/>
     </w:p>
     <w:p>
       <w:pPr>
         <w:spacing w:after="0" w:line="360" w:lineRule="auto"/>
+        <w:rPr>
+          <w:lang w:eastAsia="en-AU"/>
+        </w:rPr>
       </w:pPr>
       <w:r>
-        <w:t>Re:</w:t>
+        <w:t>Re: Salesforce Delivery Lead</w:t>
       </w:r>
     </w:p>
     <w:p>
@@ -183,7 +125,70 @@
     <w:p>
       <w:pPr>
         <w:spacing w:before="240" w:line="360" w:lineRule="auto"/>
-      </w:pPr>
+        <w:rPr>
+          <w:lang w:eastAsia="en-AU"/>
+        </w:rPr>
+      </w:pPr>
+      <w:r>
+        <w:t xml:space="preserve">I am applying for the Salesforce Delivery Lead role at </w:t>
+      </w:r>
+      <w:proofErr w:type="spellStart"/>
+      <w:r>
+        <w:t>Pepperstone</w:t>
+      </w:r>
+      <w:proofErr w:type="spellEnd"/>
+      <w:r>
+        <w:t>. I bring more than nine years of Salesforce delivery experience, backed by 30+ years across technology delivery, architecture, engineering and enterprise platforms. My background combines hands-on Salesforce expertise, agile delivery leadership and clear stakeholder management.</w:t>
+      </w:r>
+    </w:p>
+    <w:p>
+      <w:pPr>
+        <w:spacing w:before="240" w:line="360" w:lineRule="auto"/>
+        <w:rPr>
+          <w:lang w:eastAsia="en-AU"/>
+        </w:rPr>
+      </w:pPr>
+      <w:r>
+        <w:t>At Origin Energy, I established a Salesforce DevSecOps capability that replaced an unstructured fortnightly change-set process with a hybrid automated CI/CD pipeline capable of deployment every 15 hours. I led delivery across architecture, configuration, Apex, Flow, integrations, testing, approvals, security, releases and defect resolution. I also drove Sales Cloud optimisation that closed 90% of reported incidents and improved platform capacity.</w:t>
+      </w:r>
+    </w:p>
+    <w:p>
+      <w:pPr>
+        <w:spacing w:before="240" w:line="360" w:lineRule="auto"/>
+        <w:rPr>
+          <w:lang w:eastAsia="en-AU"/>
+        </w:rPr>
+      </w:pPr>
+      <w:r>
+        <w:t>At JB Hi-Fi, my Salesforce work focused on feature development and integrations. I helped design and deliver the integration between Salesforce Sales Cloud, the B2B back-end platform and an external customer procurement system, improving sales visibility and reducing manual intervention. Separately, I led BYOD front-end delivery and performance testing that validated 50,000 concurrent connections for peak trading events.</w:t>
+      </w:r>
+    </w:p>
+    <w:p>
+      <w:pPr>
+        <w:spacing w:before="240" w:line="360" w:lineRule="auto"/>
+        <w:rPr>
+          <w:lang w:eastAsia="en-AU"/>
+        </w:rPr>
+      </w:pPr>
+      <w:r>
+        <w:t>I bring practical leadership, strong technical judgement and experience working across business, architecture, testing and vendor teams. I have led and mentored technical specialists and Salesforce administrators, and I understand the governance, security and delivery discipline required in regulated environments.</w:t>
+      </w:r>
+    </w:p>
+    <w:p>
+      <w:pPr>
+        <w:spacing w:before="240" w:line="360" w:lineRule="auto"/>
+        <w:rPr>
+          <w:lang w:eastAsia="en-AU"/>
+        </w:rPr>
+      </w:pPr>
+      <w:proofErr w:type="spellStart"/>
+      <w:r>
+        <w:t>Pepperstone’s</w:t>
+      </w:r>
+      <w:proofErr w:type="spellEnd"/>
+      <w:r>
+        <w:t xml:space="preserve"> global fintech environment aligns well with my background. I would welcome the opportunity to strengthen Salesforce delivery, develop the administration team and turn business priorities into secure, high-quality outcomes.</w:t>
+      </w:r>
     </w:p>
     <w:p>
       <w:pPr>

</xml_diff>

<commit_message>
2nd Interview MAB - Momentum Energy Submit + Medibank 3 weeks interview + Pending RACV application
</commit_message>
<xml_diff>
--- a/Applications/_BaseDocuments/Efraim Taranto - Cover Letter.docx
+++ b/Applications/_BaseDocuments/Efraim Taranto - Cover Letter.docx
@@ -82,7 +82,7 @@
         <w:rPr>
           <w:noProof/>
         </w:rPr>
-        <w:t>5 October 2026</w:t>
+        <w:t>7 October 2026</w:t>
       </w:r>
       <w:r>
         <w:fldChar w:fldCharType="end"/>
@@ -95,13 +95,8 @@
         </w:rPr>
       </w:pPr>
       <w:r>
-        <w:t xml:space="preserve">To: Hiring Manager, </w:t>
+        <w:t xml:space="preserve">To: </w:t>
       </w:r>
-      <w:proofErr w:type="spellStart"/>
-      <w:r>
-        <w:t>Pepperstone</w:t>
-      </w:r>
-      <w:proofErr w:type="spellEnd"/>
     </w:p>
     <w:p>
       <w:pPr>
@@ -111,84 +106,13 @@
         </w:rPr>
       </w:pPr>
       <w:r>
-        <w:t>Re: Salesforce Delivery Lead</w:t>
+        <w:t xml:space="preserve">Re: </w:t>
       </w:r>
     </w:p>
     <w:p>
       <w:pPr>
         <w:spacing w:before="240" w:line="360" w:lineRule="auto"/>
       </w:pPr>
-      <w:r>
-        <w:t>Dear Hiring Team,</w:t>
-      </w:r>
-    </w:p>
-    <w:p>
-      <w:pPr>
-        <w:spacing w:before="240" w:line="360" w:lineRule="auto"/>
-        <w:rPr>
-          <w:lang w:eastAsia="en-AU"/>
-        </w:rPr>
-      </w:pPr>
-      <w:r>
-        <w:t xml:space="preserve">I am applying for the Salesforce Delivery Lead role at </w:t>
-      </w:r>
-      <w:proofErr w:type="spellStart"/>
-      <w:r>
-        <w:t>Pepperstone</w:t>
-      </w:r>
-      <w:proofErr w:type="spellEnd"/>
-      <w:r>
-        <w:t>. I bring more than nine years of Salesforce delivery experience, backed by 30+ years across technology delivery, architecture, engineering and enterprise platforms. My background combines hands-on Salesforce expertise, agile delivery leadership and clear stakeholder management.</w:t>
-      </w:r>
-    </w:p>
-    <w:p>
-      <w:pPr>
-        <w:spacing w:before="240" w:line="360" w:lineRule="auto"/>
-        <w:rPr>
-          <w:lang w:eastAsia="en-AU"/>
-        </w:rPr>
-      </w:pPr>
-      <w:r>
-        <w:t>At Origin Energy, I established a Salesforce DevSecOps capability that replaced an unstructured fortnightly change-set process with a hybrid automated CI/CD pipeline capable of deployment every 15 hours. I led delivery across architecture, configuration, Apex, Flow, integrations, testing, approvals, security, releases and defect resolution. I also drove Sales Cloud optimisation that closed 90% of reported incidents and improved platform capacity.</w:t>
-      </w:r>
-    </w:p>
-    <w:p>
-      <w:pPr>
-        <w:spacing w:before="240" w:line="360" w:lineRule="auto"/>
-        <w:rPr>
-          <w:lang w:eastAsia="en-AU"/>
-        </w:rPr>
-      </w:pPr>
-      <w:r>
-        <w:t>At JB Hi-Fi, my Salesforce work focused on feature development and integrations. I helped design and deliver the integration between Salesforce Sales Cloud, the B2B back-end platform and an external customer procurement system, improving sales visibility and reducing manual intervention. Separately, I led BYOD front-end delivery and performance testing that validated 50,000 concurrent connections for peak trading events.</w:t>
-      </w:r>
-    </w:p>
-    <w:p>
-      <w:pPr>
-        <w:spacing w:before="240" w:line="360" w:lineRule="auto"/>
-        <w:rPr>
-          <w:lang w:eastAsia="en-AU"/>
-        </w:rPr>
-      </w:pPr>
-      <w:r>
-        <w:t>I bring practical leadership, strong technical judgement and experience working across business, architecture, testing and vendor teams. I have led and mentored technical specialists and Salesforce administrators, and I understand the governance, security and delivery discipline required in regulated environments.</w:t>
-      </w:r>
-    </w:p>
-    <w:p>
-      <w:pPr>
-        <w:spacing w:before="240" w:line="360" w:lineRule="auto"/>
-        <w:rPr>
-          <w:lang w:eastAsia="en-AU"/>
-        </w:rPr>
-      </w:pPr>
-      <w:proofErr w:type="spellStart"/>
-      <w:r>
-        <w:t>Pepperstone’s</w:t>
-      </w:r>
-      <w:proofErr w:type="spellEnd"/>
-      <w:r>
-        <w:t xml:space="preserve"> global fintech environment aligns well with my background. I would welcome the opportunity to strengthen Salesforce delivery, develop the administration team and turn business priorities into secure, high-quality outcomes.</w:t>
-      </w:r>
     </w:p>
     <w:p>
       <w:pPr>

</xml_diff>